<commit_message>
Rename Total Nesting Events to Nests Registered, add Hatched Nests stat, reorder Turtle-Related Events map, add report logo, pin ecoscope-workflows-ext-curacao to 0.0.7
- Nests Registered now counts only (suspected) Nest events, was previously
  combining suspected+attempt+dry_run.
- New Hatched Nests stat (count of Hatching Data events), added to the
  dashboard and the Word report's stats table.
- Turtle-Related Events map moved to after Nesting Success by Species & Beach
  in the dashboard grid layout.
- Word report now shows the Sea Turtle Conservation Curacao logo centered at
  the top of the title page, and its date range includes the day.
</commit_message>
<xml_diff>
--- a/resources/templates/turtle_monitoring_template.docx
+++ b/resources/templates/turtle_monitoring_template.docx
@@ -2,6 +2,45 @@
 <file path=word/document.xml><?xml version="1.0" encoding="utf-8"?>
 <w:document xmlns:wpc="http://schemas.microsoft.com/office/word/2010/wordprocessingCanvas" xmlns:cx="http://schemas.microsoft.com/office/drawing/2014/chartex" xmlns:cx1="http://schemas.microsoft.com/office/drawing/2015/9/8/chartex" xmlns:cx2="http://schemas.microsoft.com/office/drawing/2015/10/21/chartex" xmlns:cx3="http://schemas.microsoft.com/office/drawing/2016/5/9/chartex" xmlns:cx4="http://schemas.microsoft.com/office/drawing/2016/5/10/chartex" xmlns:cx5="http://schemas.microsoft.com/office/drawing/2016/5/11/chartex" xmlns:cx6="http://schemas.microsoft.com/office/drawing/2016/5/12/chartex" xmlns:cx7="http://schemas.microsoft.com/office/drawing/2016/5/13/chartex" xmlns:cx8="http://schemas.microsoft.com/office/drawing/2016/5/14/chartex" xmlns:mc="http://schemas.openxmlformats.org/markup-compatibility/2006" xmlns:m="http://schemas.openxmlformats.org/officeDocument/2006/math" xmlns:aink="http://schemas.microsoft.com/office/drawing/2016/ink" xmlns:am3d="http://schemas.microsoft.com/office/drawing/2017/model3d" xmlns:oel="http://schemas.microsoft.com/office/2019/extlst" xmlns:r="http://schemas.openxmlformats.org/officeDocument/2006/relationships" xmlns:wp14="http://schemas.microsoft.com/office/word/2010/wordprocessingDrawing" xmlns:wp="http://schemas.openxmlformats.org/drawingml/2006/wordprocessingDrawing" xmlns:wpg="http://schemas.microsoft.com/office/word/2010/wordprocessingGroup" xmlns:wpi="http://schemas.microsoft.com/office/word/2010/wordprocessingInk" xmlns:wps="http://schemas.microsoft.com/office/word/2010/wordprocessingShape" xmlns:o="urn:schemas-microsoft-com:office:office" xmlns:v="urn:schemas-microsoft-com:vml" xmlns:w10="urn:schemas-microsoft-com:office:word" xmlns:w="http://schemas.openxmlformats.org/wordprocessingml/2006/main" xmlns:w14="http://schemas.microsoft.com/office/word/2010/wordml" xmlns:w15="http://schemas.microsoft.com/office/word/2012/wordml" xmlns:w16cei="http://schemas.microsoft.com/office/word/2026/wordml/cei" xmlns:w16cex="http://schemas.microsoft.com/office/word/2018/wordml/cex" xmlns:w16cid="http://schemas.microsoft.com/office/word/2016/wordml/cid" xmlns:w16="http://schemas.microsoft.com/office/word/2018/wordml" xmlns:w16sdtdh="http://schemas.microsoft.com/office/word/2020/wordml/sdtdatahash" xmlns:w16sdtfl="http://schemas.microsoft.com/office/word/2024/wordml/sdtformatlock" xmlns:w16se="http://schemas.microsoft.com/office/word/2015/wordml/symex" xmlns:w16du="http://schemas.microsoft.com/office/word/2023/wordml/word16du" xmlns:wne="http://schemas.microsoft.com/office/word/2006/wordml" mc:Ignorable="w14 w15 w16se w16cid w16 w16cex w16sdtdh w16sdtfl w16du wp14">
   <w:body>
+    <w:p>
+      <w:pPr>
+        <w:jc w:val="center"/>
+      </w:pPr>
+      <w:r>
+        <w:drawing>
+          <wp:inline xmlns:a="http://schemas.openxmlformats.org/drawingml/2006/main" xmlns:pic="http://schemas.openxmlformats.org/drawingml/2006/picture">
+            <wp:extent cx="2160000" cy="857799"/>
+            <wp:docPr id="1" name="Picture 1"/>
+            <wp:cNvGraphicFramePr>
+              <a:graphicFrameLocks noChangeAspect="1"/>
+            </wp:cNvGraphicFramePr>
+            <a:graphic>
+              <a:graphicData uri="http://schemas.openxmlformats.org/drawingml/2006/picture">
+                <pic:pic>
+                  <pic:nvPicPr>
+                    <pic:cNvPr id="0" name="full logo STCC_fc_transparant background.png"/>
+                    <pic:cNvPicPr/>
+                  </pic:nvPicPr>
+                  <pic:blipFill>
+                    <a:blip r:embed="rId8"/>
+                    <a:stretch>
+                      <a:fillRect/>
+                    </a:stretch>
+                  </pic:blipFill>
+                  <pic:spPr>
+                    <a:xfrm>
+                      <a:off x="0" y="0"/>
+                      <a:ext cx="2160000" cy="857799"/>
+                    </a:xfrm>
+                    <a:prstGeom prst="rect"/>
+                  </pic:spPr>
+                </pic:pic>
+              </a:graphicData>
+            </a:graphic>
+          </wp:inline>
+        </w:drawing>
+      </w:r>
+    </w:p>
     <w:p/>
     <w:p/>
     <w:p/>
@@ -125,20 +164,8 @@
             <w:vAlign w:val="center"/>
           </w:tcPr>
           <w:p>
-            <w:pPr>
-              <w:spacing w:after="160"/>
-              <w:jc w:val="center"/>
-              <w:rPr>
-                <w:sz w:val="36"/>
-                <w:szCs w:val="36"/>
-              </w:rPr>
-            </w:pPr>
             <w:r>
-              <w:rPr>
-                <w:sz w:val="36"/>
-                <w:szCs w:val="36"/>
-              </w:rPr>
-              <w:t>Total Nesting Events</w:t>
+              <w:t>Nests Registered</w:t>
             </w:r>
           </w:p>
         </w:tc>
@@ -185,6 +212,23 @@
                 <w:szCs w:val="36"/>
               </w:rPr>
               <w:t>Hatching Success</w:t>
+            </w:r>
+          </w:p>
+        </w:tc>
+        <w:tc>
+          <w:tcPr>
+            <w:tcW w:w="4998" w:type="dxa"/>
+            <w:vAlign w:val="center"/>
+          </w:tcPr>
+          <w:p>
+            <w:pPr>
+              <w:jc w:val="center"/>
+            </w:pPr>
+            <w:r>
+              <w:rPr>
+                <w:sz w:val="36"/>
+              </w:rPr>
+              <w:t>Hatched Nests</w:t>
             </w:r>
           </w:p>
         </w:tc>
@@ -335,6 +379,23 @@
               <w:t xml:space="preserve"> }}%</w:t>
             </w:r>
             <w:proofErr w:type="gramEnd"/>
+          </w:p>
+        </w:tc>
+        <w:tc>
+          <w:tcPr>
+            <w:tcW w:w="4998" w:type="dxa"/>
+            <w:vAlign w:val="center"/>
+          </w:tcPr>
+          <w:p>
+            <w:pPr>
+              <w:jc w:val="center"/>
+            </w:pPr>
+            <w:r>
+              <w:rPr>
+                <w:sz w:val="56"/>
+              </w:rPr>
+              <w:t>{{ hatched_nests_count }}</w:t>
+            </w:r>
           </w:p>
         </w:tc>
       </w:tr>

</xml_diff>